<commit_message>
Add one-command on-site start and full-screen kiosk views
- deploy/run_all.sh: start / stop / status for the whole system on Orin
  (NUCLEO reachability check with optional direct-Ethernet profile,
  inference service in Docker with the CSI camera, kiosk restart)
- deploy/tools/nucleo_test.py: on-site NUCLEO check (PING, OPEN -> ACK /
  OPENED / CLOSED, CLOSE, STOP, raw messages)
- kiosk.sh: while the kiosk runs, disable the GNOME hot corner, Super key
  overview and notification banners; restore them on disable
- kiosk page: camera view fills the screen, guidance shown as an overlay
- sync_to_orin.sh: copy run_all.sh and nucleo_test.py
- reports: dev plan wording (step 5 CLOSE fix, standby slides)

Co-Authored-By: Claude Opus 5.5 <noreply@anthropic.com>
</commit_message>
<xml_diff>
--- a/reports/recycling_ai_dev_plan_1-4.docx
+++ b/reports/recycling_ai_dev_plan_1-4.docx
@@ -51,7 +51,7 @@
           <w:noProof/>
         </w:rPr>
         <w:drawing>
-          <wp:inline distT="0" distB="0" distL="0" distR="0" wp14:anchorId="25AA8FDB" wp14:editId="1B5D7E7B">
+          <wp:inline distT="0" distB="0" distL="0" distR="0" wp14:anchorId="4C4FE245" wp14:editId="2FA84AE8">
             <wp:extent cx="5715000" cy="3333750"/>
             <wp:effectExtent l="0" t="0" r="0" b="0"/>
             <wp:docPr id="1" name="그림 1"/>
@@ -115,7 +115,7 @@
           <w:sz w:val="19"/>
           <w:szCs w:val="19"/>
         </w:rPr>
-        <w:t xml:space="preserve">OPEN,&lt;ID&gt;</w:t>
+        <w:t>OPEN,&lt;ID&gt;</w:t>
       </w:r>
       <w:r>
         <w:t xml:space="preserve"> 명령을 NUCLEO로 전달하며, NUCLEO는 해당 문을 열고 10초간 유지한 뒤 자동으로 닫습니다. 각 부분은 4장의 프로토콜 부분에 작성되어 있습니다.</w:t>
@@ -868,7 +868,7 @@
         <w:t>대기</w:t>
       </w:r>
       <w:r>
-        <w:t>: 모니터에 교육 영상 반복 재생</w:t>
+        <w:t>: 모니터에 교육 슬라이드 반복 재생</w:t>
       </w:r>
     </w:p>
     <w:p>
@@ -1003,10 +1003,22 @@
           <w:b/>
           <w:bCs/>
         </w:rPr>
-        <w:t xml:space="preserve">복귀</w:t>
-      </w:r>
-      <w:r>
-        <w:t xml:space="preserve">: OPEN 명령을 받은 NUCLEO가 해당 문을 열고 10초간 유지한 뒤 자동으로 닫습니다. </w:t>
+        <w:t>복귀</w:t>
+      </w:r>
+      <w:r>
+        <w:t>: OPEN 명령을 받은 NUCLEO가 해당 문을 열고 10초간 유지한 뒤 자동으로 닫습니다.</w:t>
+      </w:r>
+      <w:r>
+        <w:t xml:space="preserve"> Jetson</w:t>
+      </w:r>
+      <w:r>
+        <w:rPr>
+          <w:rFonts w:hint="eastAsia"/>
+        </w:rPr>
+        <w:t>은</w:t>
+      </w:r>
+      <w:r>
+        <w:t xml:space="preserve"> </w:t>
       </w:r>
       <w:r>
         <w:rPr>
@@ -1017,10 +1029,65 @@
           <w:sz w:val="19"/>
           <w:szCs w:val="19"/>
         </w:rPr>
-        <w:t xml:space="preserve">CLOSED,&lt;ID&gt;</w:t>
-      </w:r>
-      <w:r>
-        <w:t xml:space="preserve"> 수신 후 로그를 저장하고 대기 상태로 복귀합니다. 물체가 3초 이상 사라져도 대기로 복귀합니다.</w:t>
+        <w:t>CLOSED,&lt;ID&gt;</w:t>
+      </w:r>
+      <w:r>
+        <w:t xml:space="preserve"> 수신 후 로그를 저장하고 대기 상태</w:t>
+      </w:r>
+      <w:r>
+        <w:rPr>
+          <w:rFonts w:hint="eastAsia"/>
+        </w:rPr>
+        <w:t>(대기 슬라이드)</w:t>
+      </w:r>
+      <w:r>
+        <w:t xml:space="preserve">로 복귀합니다. </w:t>
+      </w:r>
+      <w:r>
+        <w:t>20</w:t>
+      </w:r>
+      <w:r>
+        <w:rPr>
+          <w:rFonts w:hint="eastAsia"/>
+        </w:rPr>
+        <w:t xml:space="preserve">초 안에 </w:t>
+      </w:r>
+      <w:r>
+        <w:rPr>
+          <w:rFonts w:ascii="Consolas" w:hAnsi="Consolas" w:cs="Consolas"/>
+          <w:b/>
+          <w:bCs/>
+          <w:color w:val="B42318"/>
+          <w:sz w:val="19"/>
+          <w:szCs w:val="19"/>
+        </w:rPr>
+        <w:t>CLOSED</w:t>
+      </w:r>
+      <w:r>
+        <w:rPr>
+          <w:rFonts w:hint="eastAsia"/>
+        </w:rPr>
+        <w:t>가 오지 않으면</w:t>
+      </w:r>
+      <w:r>
+        <w:t xml:space="preserve">, </w:t>
+      </w:r>
+      <w:r>
+        <w:rPr>
+          <w:rFonts w:ascii="Consolas" w:hAnsi="Consolas" w:cs="Consolas"/>
+          <w:b/>
+          <w:bCs/>
+          <w:color w:val="B42318"/>
+          <w:sz w:val="19"/>
+          <w:szCs w:val="19"/>
+        </w:rPr>
+        <w:t>CLOSE,&lt;ID&gt;</w:t>
+      </w:r>
+      <w:r>
+        <w:rPr>
+          <w:rFonts w:hint="eastAsia"/>
+        </w:rPr>
+        <w:t>를 보내고 오류로 기록합니다.</w:t>
       </w:r>
     </w:p>
     <w:p>
@@ -1372,6 +1439,7 @@
                 <w:sz w:val="19"/>
                 <w:szCs w:val="19"/>
               </w:rPr>
+              <w:lastRenderedPageBreak/>
               <w:t>glass_packaging</w:t>
             </w:r>
             <w:r>
@@ -1482,7 +1550,6 @@
                 <w:sz w:val="19"/>
                 <w:szCs w:val="19"/>
               </w:rPr>
-              <w:lastRenderedPageBreak/>
               <w:t>pet_dirty_packaging</w:t>
             </w:r>
           </w:p>
@@ -1576,6 +1643,20 @@
     </w:p>
     <w:p>
       <w:pPr>
+        <w:spacing w:after="140" w:line="300" w:lineRule="auto"/>
+      </w:pPr>
+      <w:r>
+        <w:rPr>
+          <w:rFonts w:hint="eastAsia"/>
+        </w:rPr>
+        <w:t>감</w:t>
+      </w:r>
+      <w:r>
+        <w:t>지·판정·안내 중에 물체가 3초 이상 사라지면 대기로 복귀합니다.</w:t>
+      </w:r>
+    </w:p>
+    <w:p>
+      <w:pPr>
         <w:pStyle w:val="1"/>
       </w:pPr>
       <w:r>
@@ -1598,7 +1679,7 @@
           <w:sz w:val="19"/>
           <w:szCs w:val="19"/>
         </w:rPr>
-        <w:t xml:space="preserve">OPEN,&lt;ID&gt;</w:t>
+        <w:t>OPEN,&lt;ID&gt;</w:t>
       </w:r>
       <w:r>
         <w:t xml:space="preserve"> 명령을 전송합니다. NUCLEO는 해당 문을 열고 </w:t>
@@ -1608,7 +1689,7 @@
           <w:b/>
           <w:bCs/>
         </w:rPr>
-        <w:t xml:space="preserve">10초간 유지한 뒤 자동으로 닫는 시퀀스</w:t>
+        <w:t>10초간 유지한 뒤 자동으로 닫는 시퀀스</w:t>
       </w:r>
       <w:r>
         <w:t xml:space="preserve">를 수행합니다. </w:t>
@@ -1622,10 +1703,10 @@
           <w:sz w:val="19"/>
           <w:szCs w:val="19"/>
         </w:rPr>
-        <w:t xml:space="preserve">CLOSE,&lt;ID&gt;</w:t>
-      </w:r>
-      <w:r>
-        <w:t xml:space="preserve">는 필요 시 즉시 닫기 위한 수동/예외 제어 명령으로 사용합니다.</w:t>
+        <w:t>CLOSE,&lt;ID&gt;</w:t>
+      </w:r>
+      <w:r>
+        <w:t>는 필요 시 즉시 닫기 위한 수동/예외 제어 명령으로 사용합니다.</w:t>
       </w:r>
     </w:p>
     <w:p>
@@ -2064,7 +2145,7 @@
                 <w:sz w:val="19"/>
                 <w:szCs w:val="19"/>
               </w:rPr>
-              <w:t xml:space="preserve">자동 닫기</w:t>
+              <w:t>자동 닫기</w:t>
             </w:r>
           </w:p>
         </w:tc>
@@ -2094,7 +2175,7 @@
                 <w:sz w:val="19"/>
                 <w:szCs w:val="19"/>
               </w:rPr>
-              <w:t xml:space="preserve">NUCLEO가 OPEN 수행 후 10초 유지 뒤 자동 닫기</w:t>
+              <w:t>NUCLEO가 OPEN 수행 후 10초 유지 뒤 자동 닫기</w:t>
             </w:r>
           </w:p>
         </w:tc>
@@ -2126,7 +2207,7 @@
                 <w:sz w:val="19"/>
                 <w:szCs w:val="19"/>
               </w:rPr>
-              <w:t xml:space="preserve">CLOSE 명령</w:t>
+              <w:t>CLOSE 명령</w:t>
             </w:r>
           </w:p>
         </w:tc>
@@ -2156,7 +2237,7 @@
                 <w:sz w:val="19"/>
                 <w:szCs w:val="19"/>
               </w:rPr>
-              <w:t xml:space="preserve">필요 시 즉시 닫기 위한 수동/예외 제어</w:t>
+              <w:t>필요 시 즉시 닫기 위한 수동/예외 제어</w:t>
             </w:r>
           </w:p>
         </w:tc>
@@ -2372,7 +2453,7 @@
                 <w:sz w:val="19"/>
                 <w:szCs w:val="19"/>
               </w:rPr>
-              <w:t xml:space="preserve">해당 문 열기 → 10초 유지 → 자동 닫기</w:t>
+              <w:t>해당 문 열기 → 10초 유지 → 자동 닫기</w:t>
             </w:r>
           </w:p>
         </w:tc>
@@ -2436,7 +2517,7 @@
                 <w:sz w:val="19"/>
                 <w:szCs w:val="19"/>
               </w:rPr>
-              <w:t xml:space="preserve">수동/예외 상황</w:t>
+              <w:t>수동/예외 상황</w:t>
             </w:r>
           </w:p>
         </w:tc>
@@ -2466,7 +2547,7 @@
                 <w:sz w:val="19"/>
                 <w:szCs w:val="19"/>
               </w:rPr>
-              <w:t xml:space="preserve">해당 문 즉시 닫기</w:t>
+              <w:t>해당 문 즉시 닫기</w:t>
             </w:r>
           </w:p>
         </w:tc>
@@ -2500,6 +2581,7 @@
                 <w:sz w:val="19"/>
                 <w:szCs w:val="19"/>
               </w:rPr>
+              <w:lastRenderedPageBreak/>
               <w:t>STOP,&lt;ID&gt;</w:t>
             </w:r>
           </w:p>
@@ -2688,7 +2770,6 @@
         <w:pStyle w:val="2"/>
       </w:pPr>
       <w:r>
-        <w:lastRenderedPageBreak/>
         <w:t>4.3 응답 (NUCLEO → Jetson)</w:t>
       </w:r>
     </w:p>
@@ -2891,16 +2972,13 @@
           <w:p>
             <w:pPr>
               <w:spacing w:line="270" w:lineRule="auto"/>
-              <w:rPr>
-                <w:rFonts w:hint="eastAsia"/>
-              </w:rPr>
-            </w:pPr>
-            <w:r>
-              <w:rPr>
-                <w:sz w:val="19"/>
-                <w:szCs w:val="19"/>
-              </w:rPr>
-              <w:t xml:space="preserve">해당 문 열기 완료</w:t>
+            </w:pPr>
+            <w:r>
+              <w:rPr>
+                <w:sz w:val="19"/>
+                <w:szCs w:val="19"/>
+              </w:rPr>
+              <w:t>해당 문 열기 완료</w:t>
             </w:r>
           </w:p>
         </w:tc>
@@ -2982,7 +3060,7 @@
                 <w:sz w:val="19"/>
                 <w:szCs w:val="19"/>
               </w:rPr>
-              <w:t xml:space="preserve">자동 닫힘 또는 CLOSE 명령에 의한 닫기 완료</w:t>
+              <w:t>자동 닫힘 또는 CLOSE 명령에 의한 닫기 완료</w:t>
             </w:r>
           </w:p>
         </w:tc>
@@ -3349,7 +3427,103 @@
           <w:sz w:val="18"/>
           <w:szCs w:val="18"/>
         </w:rPr>
-        <w:t xml:space="preserve">      ... NUCLEO에서 10초 유지 후 자동 닫기 ...</w:t>
+        <w:t xml:space="preserve">      ... NUCLEO</w:t>
+      </w:r>
+      <w:r>
+        <w:rPr>
+          <w:rFonts w:ascii="Consolas" w:hAnsi="Consolas" w:cs="Consolas"/>
+          <w:sz w:val="18"/>
+          <w:szCs w:val="18"/>
+        </w:rPr>
+        <w:t>에서</w:t>
+      </w:r>
+      <w:r>
+        <w:rPr>
+          <w:rFonts w:ascii="Consolas" w:hAnsi="Consolas" w:cs="Consolas"/>
+          <w:sz w:val="18"/>
+          <w:szCs w:val="18"/>
+        </w:rPr>
+        <w:t xml:space="preserve"> 10</w:t>
+      </w:r>
+      <w:r>
+        <w:rPr>
+          <w:rFonts w:ascii="Consolas" w:hAnsi="Consolas" w:cs="Consolas"/>
+          <w:sz w:val="18"/>
+          <w:szCs w:val="18"/>
+        </w:rPr>
+        <w:t>초</w:t>
+      </w:r>
+      <w:r>
+        <w:rPr>
+          <w:rFonts w:ascii="Consolas" w:hAnsi="Consolas" w:cs="Consolas"/>
+          <w:sz w:val="18"/>
+          <w:szCs w:val="18"/>
+        </w:rPr>
+        <w:t xml:space="preserve"> </w:t>
+      </w:r>
+      <w:r>
+        <w:rPr>
+          <w:rFonts w:ascii="Consolas" w:hAnsi="Consolas" w:cs="Consolas"/>
+          <w:sz w:val="18"/>
+          <w:szCs w:val="18"/>
+        </w:rPr>
+        <w:t>유지</w:t>
+      </w:r>
+      <w:r>
+        <w:rPr>
+          <w:rFonts w:ascii="Consolas" w:hAnsi="Consolas" w:cs="Consolas"/>
+          <w:sz w:val="18"/>
+          <w:szCs w:val="18"/>
+        </w:rPr>
+        <w:t xml:space="preserve"> </w:t>
+      </w:r>
+      <w:r>
+        <w:rPr>
+          <w:rFonts w:ascii="Consolas" w:hAnsi="Consolas" w:cs="Consolas"/>
+          <w:sz w:val="18"/>
+          <w:szCs w:val="18"/>
+        </w:rPr>
+        <w:t>후</w:t>
+      </w:r>
+      <w:r>
+        <w:rPr>
+          <w:rFonts w:ascii="Consolas" w:hAnsi="Consolas" w:cs="Consolas"/>
+          <w:sz w:val="18"/>
+          <w:szCs w:val="18"/>
+        </w:rPr>
+        <w:t xml:space="preserve"> </w:t>
+      </w:r>
+      <w:r>
+        <w:rPr>
+          <w:rFonts w:ascii="Consolas" w:hAnsi="Consolas" w:cs="Consolas"/>
+          <w:sz w:val="18"/>
+          <w:szCs w:val="18"/>
+        </w:rPr>
+        <w:t>자동</w:t>
+      </w:r>
+      <w:r>
+        <w:rPr>
+          <w:rFonts w:ascii="Consolas" w:hAnsi="Consolas" w:cs="Consolas"/>
+          <w:sz w:val="18"/>
+          <w:szCs w:val="18"/>
+        </w:rPr>
+        <w:t xml:space="preserve"> </w:t>
+      </w:r>
+      <w:r>
+        <w:rPr>
+          <w:rFonts w:ascii="Consolas" w:hAnsi="Consolas" w:cs="Consolas"/>
+          <w:sz w:val="18"/>
+          <w:szCs w:val="18"/>
+        </w:rPr>
+        <w:t>닫기</w:t>
+      </w:r>
+      <w:r>
+        <w:rPr>
+          <w:rFonts w:ascii="Consolas" w:hAnsi="Consolas" w:cs="Consolas"/>
+          <w:sz w:val="18"/>
+          <w:szCs w:val="18"/>
+        </w:rPr>
+        <w:t xml:space="preserve"> ...</w:t>
       </w:r>
     </w:p>
     <w:p>
@@ -3454,7 +3628,7 @@
           <w:sz w:val="19"/>
           <w:szCs w:val="19"/>
         </w:rPr>
-        <w:t xml:space="preserve">CLOSE</w:t>
+        <w:t>CLOSE</w:t>
       </w:r>
       <w:r>
         <w:t xml:space="preserve"> 명령은 필요 시 즉시 닫기 위한 수동/예외 제어에 사용합니다.</w:t>

</xml_diff>